<commit_message>
feat: agregar 6 nuevas estudiantes y actualizar Word de credenciales
</commit_message>
<xml_diff>
--- a/Credenciales_Polyglot_Map_Bootcamp.docx
+++ b/Credenciales_Polyglot_Map_Bootcamp.docx
@@ -388,7 +388,7 @@
           <w:sz w:val="26"/>
           <w:szCs w:val="26"/>
         </w:rPr>
-        <w:t xml:space="preserve">2. CREDENCIALES DE ESTUDIANTES INSCRITOS (NOMBRE PROPIO)</w:t>
+        <w:t xml:space="preserve">2. CREDENCIALES DE ESTUDIANTES INSCRITOS (16 ALUMNOS NOMINALES)</w:t>
       </w:r>
     </w:p>
     <w:p>
@@ -402,7 +402,7 @@
           <w:sz w:val="20"/>
           <w:szCs w:val="20"/>
         </w:rPr>
-        <w:t xml:space="preserve">Nota: Los estudiantes pueden ingresar escribiendo su usuario (ej. jefferson.pena) o su nombre y apellido.</w:t>
+        <w:t xml:space="preserve">Nota: Los estudiantes pueden ingresar escribiendo su usuario (ej. rosa.chavez) o su nombre y apellido.</w:t>
       </w:r>
     </w:p>
     <w:tbl>
@@ -1281,6 +1281,474 @@
                 <w:szCs w:val="20"/>
               </w:rPr>
               <w:t xml:space="preserve">PM-ANA482</w:t>
+            </w:r>
+          </w:p>
+        </w:tc>
+      </w:tr>
+      <w:tr>
+        <w:tc>
+          <w:tcPr>
+            <w:shd w:val="clear" w:color="auto" w:fill="FFFFFF"/>
+          </w:tcPr>
+          <w:p>
+            <w:pPr>
+              <w:spacing w:before="40" w:after="40"/>
+            </w:pPr>
+            <w:r>
+              <w:rPr>
+                <w:rFonts w:ascii="Calibri" w:hAnsi="Calibri"/>
+                <w:color w:val="1E293B"/>
+                <w:sz w:val="20"/>
+                <w:szCs w:val="20"/>
+              </w:rPr>
+              <w:t xml:space="preserve">11</w:t>
+            </w:r>
+          </w:p>
+        </w:tc>
+        <w:tc>
+          <w:tcPr>
+            <w:shd w:val="clear" w:color="auto" w:fill="FFFFFF"/>
+          </w:tcPr>
+          <w:p>
+            <w:pPr>
+              <w:spacing w:before="40" w:after="40"/>
+            </w:pPr>
+            <w:r>
+              <w:rPr>
+                <w:rFonts w:ascii="Calibri" w:hAnsi="Calibri"/>
+                <w:color w:val="1E293B"/>
+                <w:sz w:val="20"/>
+                <w:szCs w:val="20"/>
+              </w:rPr>
+              <w:t xml:space="preserve">Rosa Chávez Callo</w:t>
+            </w:r>
+          </w:p>
+        </w:tc>
+        <w:tc>
+          <w:tcPr>
+            <w:shd w:val="clear" w:color="auto" w:fill="FFFFFF"/>
+          </w:tcPr>
+          <w:p>
+            <w:pPr>
+              <w:spacing w:before="40" w:after="40"/>
+            </w:pPr>
+            <w:r>
+              <w:rPr>
+                <w:rFonts w:ascii="Calibri" w:hAnsi="Calibri"/>
+                <w:color w:val="1E293B"/>
+                <w:sz w:val="20"/>
+                <w:szCs w:val="20"/>
+              </w:rPr>
+              <w:t xml:space="preserve">rosa.chavez</w:t>
+            </w:r>
+          </w:p>
+        </w:tc>
+        <w:tc>
+          <w:tcPr>
+            <w:shd w:val="clear" w:color="auto" w:fill="FFFFFF"/>
+          </w:tcPr>
+          <w:p>
+            <w:pPr>
+              <w:spacing w:before="40" w:after="40"/>
+            </w:pPr>
+            <w:r>
+              <w:rPr>
+                <w:rFonts w:ascii="Calibri" w:hAnsi="Calibri"/>
+                <w:color w:val="1E293B"/>
+                <w:sz w:val="20"/>
+                <w:szCs w:val="20"/>
+              </w:rPr>
+              <w:t xml:space="preserve">PM-RCC538</w:t>
+            </w:r>
+          </w:p>
+        </w:tc>
+      </w:tr>
+      <w:tr>
+        <w:tc>
+          <w:tcPr>
+            <w:shd w:val="clear" w:color="auto" w:fill="F8FAFC"/>
+          </w:tcPr>
+          <w:p>
+            <w:pPr>
+              <w:spacing w:before="40" w:after="40"/>
+            </w:pPr>
+            <w:r>
+              <w:rPr>
+                <w:rFonts w:ascii="Calibri" w:hAnsi="Calibri"/>
+                <w:color w:val="1E293B"/>
+                <w:sz w:val="20"/>
+                <w:szCs w:val="20"/>
+              </w:rPr>
+              <w:t xml:space="preserve">12</w:t>
+            </w:r>
+          </w:p>
+        </w:tc>
+        <w:tc>
+          <w:tcPr>
+            <w:shd w:val="clear" w:color="auto" w:fill="F8FAFC"/>
+          </w:tcPr>
+          <w:p>
+            <w:pPr>
+              <w:spacing w:before="40" w:after="40"/>
+            </w:pPr>
+            <w:r>
+              <w:rPr>
+                <w:rFonts w:ascii="Calibri" w:hAnsi="Calibri"/>
+                <w:color w:val="1E293B"/>
+                <w:sz w:val="20"/>
+                <w:szCs w:val="20"/>
+              </w:rPr>
+              <w:t xml:space="preserve">Julissa Pérez León</w:t>
+            </w:r>
+          </w:p>
+        </w:tc>
+        <w:tc>
+          <w:tcPr>
+            <w:shd w:val="clear" w:color="auto" w:fill="F8FAFC"/>
+          </w:tcPr>
+          <w:p>
+            <w:pPr>
+              <w:spacing w:before="40" w:after="40"/>
+            </w:pPr>
+            <w:r>
+              <w:rPr>
+                <w:rFonts w:ascii="Calibri" w:hAnsi="Calibri"/>
+                <w:color w:val="1E293B"/>
+                <w:sz w:val="20"/>
+                <w:szCs w:val="20"/>
+              </w:rPr>
+              <w:t xml:space="preserve">julissa.perez</w:t>
+            </w:r>
+          </w:p>
+        </w:tc>
+        <w:tc>
+          <w:tcPr>
+            <w:shd w:val="clear" w:color="auto" w:fill="F8FAFC"/>
+          </w:tcPr>
+          <w:p>
+            <w:pPr>
+              <w:spacing w:before="40" w:after="40"/>
+            </w:pPr>
+            <w:r>
+              <w:rPr>
+                <w:rFonts w:ascii="Calibri" w:hAnsi="Calibri"/>
+                <w:color w:val="1E293B"/>
+                <w:sz w:val="20"/>
+                <w:szCs w:val="20"/>
+              </w:rPr>
+              <w:t xml:space="preserve">PM-JUL641</w:t>
+            </w:r>
+          </w:p>
+        </w:tc>
+      </w:tr>
+      <w:tr>
+        <w:tc>
+          <w:tcPr>
+            <w:shd w:val="clear" w:color="auto" w:fill="FFFFFF"/>
+          </w:tcPr>
+          <w:p>
+            <w:pPr>
+              <w:spacing w:before="40" w:after="40"/>
+            </w:pPr>
+            <w:r>
+              <w:rPr>
+                <w:rFonts w:ascii="Calibri" w:hAnsi="Calibri"/>
+                <w:color w:val="1E293B"/>
+                <w:sz w:val="20"/>
+                <w:szCs w:val="20"/>
+              </w:rPr>
+              <w:t xml:space="preserve">13</w:t>
+            </w:r>
+          </w:p>
+        </w:tc>
+        <w:tc>
+          <w:tcPr>
+            <w:shd w:val="clear" w:color="auto" w:fill="FFFFFF"/>
+          </w:tcPr>
+          <w:p>
+            <w:pPr>
+              <w:spacing w:before="40" w:after="40"/>
+            </w:pPr>
+            <w:r>
+              <w:rPr>
+                <w:rFonts w:ascii="Calibri" w:hAnsi="Calibri"/>
+                <w:color w:val="1E293B"/>
+                <w:sz w:val="20"/>
+                <w:szCs w:val="20"/>
+              </w:rPr>
+              <w:t xml:space="preserve">Ana Martha Chacón Ramos</w:t>
+            </w:r>
+          </w:p>
+        </w:tc>
+        <w:tc>
+          <w:tcPr>
+            <w:shd w:val="clear" w:color="auto" w:fill="FFFFFF"/>
+          </w:tcPr>
+          <w:p>
+            <w:pPr>
+              <w:spacing w:before="40" w:after="40"/>
+            </w:pPr>
+            <w:r>
+              <w:rPr>
+                <w:rFonts w:ascii="Calibri" w:hAnsi="Calibri"/>
+                <w:color w:val="1E293B"/>
+                <w:sz w:val="20"/>
+                <w:szCs w:val="20"/>
+              </w:rPr>
+              <w:t xml:space="preserve">ana.chacon</w:t>
+            </w:r>
+          </w:p>
+        </w:tc>
+        <w:tc>
+          <w:tcPr>
+            <w:shd w:val="clear" w:color="auto" w:fill="FFFFFF"/>
+          </w:tcPr>
+          <w:p>
+            <w:pPr>
+              <w:spacing w:before="40" w:after="40"/>
+            </w:pPr>
+            <w:r>
+              <w:rPr>
+                <w:rFonts w:ascii="Calibri" w:hAnsi="Calibri"/>
+                <w:color w:val="1E293B"/>
+                <w:sz w:val="20"/>
+                <w:szCs w:val="20"/>
+              </w:rPr>
+              <w:t xml:space="preserve">PM-AMC719</w:t>
+            </w:r>
+          </w:p>
+        </w:tc>
+      </w:tr>
+      <w:tr>
+        <w:tc>
+          <w:tcPr>
+            <w:shd w:val="clear" w:color="auto" w:fill="F8FAFC"/>
+          </w:tcPr>
+          <w:p>
+            <w:pPr>
+              <w:spacing w:before="40" w:after="40"/>
+            </w:pPr>
+            <w:r>
+              <w:rPr>
+                <w:rFonts w:ascii="Calibri" w:hAnsi="Calibri"/>
+                <w:color w:val="1E293B"/>
+                <w:sz w:val="20"/>
+                <w:szCs w:val="20"/>
+              </w:rPr>
+              <w:t xml:space="preserve">14</w:t>
+            </w:r>
+          </w:p>
+        </w:tc>
+        <w:tc>
+          <w:tcPr>
+            <w:shd w:val="clear" w:color="auto" w:fill="F8FAFC"/>
+          </w:tcPr>
+          <w:p>
+            <w:pPr>
+              <w:spacing w:before="40" w:after="40"/>
+            </w:pPr>
+            <w:r>
+              <w:rPr>
+                <w:rFonts w:ascii="Calibri" w:hAnsi="Calibri"/>
+                <w:color w:val="1E293B"/>
+                <w:sz w:val="20"/>
+                <w:szCs w:val="20"/>
+              </w:rPr>
+              <w:t xml:space="preserve">Alessandra Morales</w:t>
+            </w:r>
+          </w:p>
+        </w:tc>
+        <w:tc>
+          <w:tcPr>
+            <w:shd w:val="clear" w:color="auto" w:fill="F8FAFC"/>
+          </w:tcPr>
+          <w:p>
+            <w:pPr>
+              <w:spacing w:before="40" w:after="40"/>
+            </w:pPr>
+            <w:r>
+              <w:rPr>
+                <w:rFonts w:ascii="Calibri" w:hAnsi="Calibri"/>
+                <w:color w:val="1E293B"/>
+                <w:sz w:val="20"/>
+                <w:szCs w:val="20"/>
+              </w:rPr>
+              <w:t xml:space="preserve">alessandra.morales</w:t>
+            </w:r>
+          </w:p>
+        </w:tc>
+        <w:tc>
+          <w:tcPr>
+            <w:shd w:val="clear" w:color="auto" w:fill="F8FAFC"/>
+          </w:tcPr>
+          <w:p>
+            <w:pPr>
+              <w:spacing w:before="40" w:after="40"/>
+            </w:pPr>
+            <w:r>
+              <w:rPr>
+                <w:rFonts w:ascii="Calibri" w:hAnsi="Calibri"/>
+                <w:color w:val="1E293B"/>
+                <w:sz w:val="20"/>
+                <w:szCs w:val="20"/>
+              </w:rPr>
+              <w:t xml:space="preserve">PM-ALE825</w:t>
+            </w:r>
+          </w:p>
+        </w:tc>
+      </w:tr>
+      <w:tr>
+        <w:tc>
+          <w:tcPr>
+            <w:shd w:val="clear" w:color="auto" w:fill="FFFFFF"/>
+          </w:tcPr>
+          <w:p>
+            <w:pPr>
+              <w:spacing w:before="40" w:after="40"/>
+            </w:pPr>
+            <w:r>
+              <w:rPr>
+                <w:rFonts w:ascii="Calibri" w:hAnsi="Calibri"/>
+                <w:color w:val="1E293B"/>
+                <w:sz w:val="20"/>
+                <w:szCs w:val="20"/>
+              </w:rPr>
+              <w:t xml:space="preserve">15</w:t>
+            </w:r>
+          </w:p>
+        </w:tc>
+        <w:tc>
+          <w:tcPr>
+            <w:shd w:val="clear" w:color="auto" w:fill="FFFFFF"/>
+          </w:tcPr>
+          <w:p>
+            <w:pPr>
+              <w:spacing w:before="40" w:after="40"/>
+            </w:pPr>
+            <w:r>
+              <w:rPr>
+                <w:rFonts w:ascii="Calibri" w:hAnsi="Calibri"/>
+                <w:color w:val="1E293B"/>
+                <w:sz w:val="20"/>
+                <w:szCs w:val="20"/>
+              </w:rPr>
+              <w:t xml:space="preserve">Katherine María Isabel Tiburcio Maldonado</w:t>
+            </w:r>
+          </w:p>
+        </w:tc>
+        <w:tc>
+          <w:tcPr>
+            <w:shd w:val="clear" w:color="auto" w:fill="FFFFFF"/>
+          </w:tcPr>
+          <w:p>
+            <w:pPr>
+              <w:spacing w:before="40" w:after="40"/>
+            </w:pPr>
+            <w:r>
+              <w:rPr>
+                <w:rFonts w:ascii="Calibri" w:hAnsi="Calibri"/>
+                <w:color w:val="1E293B"/>
+                <w:sz w:val="20"/>
+                <w:szCs w:val="20"/>
+              </w:rPr>
+              <w:t xml:space="preserve">katherine.tiburcio</w:t>
+            </w:r>
+          </w:p>
+        </w:tc>
+        <w:tc>
+          <w:tcPr>
+            <w:shd w:val="clear" w:color="auto" w:fill="FFFFFF"/>
+          </w:tcPr>
+          <w:p>
+            <w:pPr>
+              <w:spacing w:before="40" w:after="40"/>
+            </w:pPr>
+            <w:r>
+              <w:rPr>
+                <w:rFonts w:ascii="Calibri" w:hAnsi="Calibri"/>
+                <w:color w:val="1E293B"/>
+                <w:sz w:val="20"/>
+                <w:szCs w:val="20"/>
+              </w:rPr>
+              <w:t xml:space="preserve">PM-KAT394</w:t>
+            </w:r>
+          </w:p>
+        </w:tc>
+      </w:tr>
+      <w:tr>
+        <w:tc>
+          <w:tcPr>
+            <w:shd w:val="clear" w:color="auto" w:fill="F8FAFC"/>
+          </w:tcPr>
+          <w:p>
+            <w:pPr>
+              <w:spacing w:before="40" w:after="40"/>
+            </w:pPr>
+            <w:r>
+              <w:rPr>
+                <w:rFonts w:ascii="Calibri" w:hAnsi="Calibri"/>
+                <w:color w:val="1E293B"/>
+                <w:sz w:val="20"/>
+                <w:szCs w:val="20"/>
+              </w:rPr>
+              <w:t xml:space="preserve">16</w:t>
+            </w:r>
+          </w:p>
+        </w:tc>
+        <w:tc>
+          <w:tcPr>
+            <w:shd w:val="clear" w:color="auto" w:fill="F8FAFC"/>
+          </w:tcPr>
+          <w:p>
+            <w:pPr>
+              <w:spacing w:before="40" w:after="40"/>
+            </w:pPr>
+            <w:r>
+              <w:rPr>
+                <w:rFonts w:ascii="Calibri" w:hAnsi="Calibri"/>
+                <w:color w:val="1E293B"/>
+                <w:sz w:val="20"/>
+                <w:szCs w:val="20"/>
+              </w:rPr>
+              <w:t xml:space="preserve">Rosa Margarita Tocuyo</w:t>
+            </w:r>
+          </w:p>
+        </w:tc>
+        <w:tc>
+          <w:tcPr>
+            <w:shd w:val="clear" w:color="auto" w:fill="F8FAFC"/>
+          </w:tcPr>
+          <w:p>
+            <w:pPr>
+              <w:spacing w:before="40" w:after="40"/>
+            </w:pPr>
+            <w:r>
+              <w:rPr>
+                <w:rFonts w:ascii="Calibri" w:hAnsi="Calibri"/>
+                <w:color w:val="1E293B"/>
+                <w:sz w:val="20"/>
+                <w:szCs w:val="20"/>
+              </w:rPr>
+              <w:t xml:space="preserve">rosa.tocuyo</w:t>
+            </w:r>
+          </w:p>
+        </w:tc>
+        <w:tc>
+          <w:tcPr>
+            <w:shd w:val="clear" w:color="auto" w:fill="F8FAFC"/>
+          </w:tcPr>
+          <w:p>
+            <w:pPr>
+              <w:spacing w:before="40" w:after="40"/>
+            </w:pPr>
+            <w:r>
+              <w:rPr>
+                <w:rFonts w:ascii="Calibri" w:hAnsi="Calibri"/>
+                <w:color w:val="1E293B"/>
+                <w:sz w:val="20"/>
+                <w:szCs w:val="20"/>
+              </w:rPr>
+              <w:t xml:space="preserve">PM-RMT467</w:t>
             </w:r>
           </w:p>
         </w:tc>

</xml_diff>

<commit_message>
feat: agregar 14 nuevos estudiantes, especificar A2 Pre-intermedio y actualizar Word
</commit_message>
<xml_diff>
--- a/Credenciales_Polyglot_Map_Bootcamp.docx
+++ b/Credenciales_Polyglot_Map_Bootcamp.docx
@@ -216,7 +216,7 @@
                 <w:sz w:val="20"/>
                 <w:szCs w:val="20"/>
               </w:rPr>
-              <w:t xml:space="preserve">Conversational English Bootcamp (Inglés A2)</w:t>
+              <w:t xml:space="preserve">Conversational English Bootcamp (Inglés A2 · Pre-intermedio)</w:t>
             </w:r>
           </w:p>
         </w:tc>
@@ -388,7 +388,7 @@
           <w:sz w:val="26"/>
           <w:szCs w:val="26"/>
         </w:rPr>
-        <w:t xml:space="preserve">2. CREDENCIALES DE ESTUDIANTES INSCRITOS (16 ALUMNOS NOMINALES)</w:t>
+        <w:t xml:space="preserve">2. CREDENCIALES DE ESTUDIANTES INSCRITOS (30 ALUMNOS NOMINALES)</w:t>
       </w:r>
     </w:p>
     <w:p>
@@ -402,7 +402,7 @@
           <w:sz w:val="20"/>
           <w:szCs w:val="20"/>
         </w:rPr>
-        <w:t xml:space="preserve">Nota: Los estudiantes pueden ingresar escribiendo su usuario (ej. rosa.chavez) o su nombre y apellido.</w:t>
+        <w:t xml:space="preserve">Nota: Los estudiantes pueden ingresar escribiendo su usuario (ej. magda.luna) o su nombre y apellido.</w:t>
       </w:r>
     </w:p>
     <w:tbl>
@@ -1749,6 +1749,1098 @@
                 <w:szCs w:val="20"/>
               </w:rPr>
               <w:t xml:space="preserve">PM-RMT467</w:t>
+            </w:r>
+          </w:p>
+        </w:tc>
+      </w:tr>
+      <w:tr>
+        <w:tc>
+          <w:tcPr>
+            <w:shd w:val="clear" w:color="auto" w:fill="FFFFFF"/>
+          </w:tcPr>
+          <w:p>
+            <w:pPr>
+              <w:spacing w:before="40" w:after="40"/>
+            </w:pPr>
+            <w:r>
+              <w:rPr>
+                <w:rFonts w:ascii="Calibri" w:hAnsi="Calibri"/>
+                <w:color w:val="1E293B"/>
+                <w:sz w:val="20"/>
+                <w:szCs w:val="20"/>
+              </w:rPr>
+              <w:t xml:space="preserve">17</w:t>
+            </w:r>
+          </w:p>
+        </w:tc>
+        <w:tc>
+          <w:tcPr>
+            <w:shd w:val="clear" w:color="auto" w:fill="FFFFFF"/>
+          </w:tcPr>
+          <w:p>
+            <w:pPr>
+              <w:spacing w:before="40" w:after="40"/>
+            </w:pPr>
+            <w:r>
+              <w:rPr>
+                <w:rFonts w:ascii="Calibri" w:hAnsi="Calibri"/>
+                <w:color w:val="1E293B"/>
+                <w:sz w:val="20"/>
+                <w:szCs w:val="20"/>
+              </w:rPr>
+              <w:t xml:space="preserve">Magda Juana Luna Herrera Viuda de Mansilla</w:t>
+            </w:r>
+          </w:p>
+        </w:tc>
+        <w:tc>
+          <w:tcPr>
+            <w:shd w:val="clear" w:color="auto" w:fill="FFFFFF"/>
+          </w:tcPr>
+          <w:p>
+            <w:pPr>
+              <w:spacing w:before="40" w:after="40"/>
+            </w:pPr>
+            <w:r>
+              <w:rPr>
+                <w:rFonts w:ascii="Calibri" w:hAnsi="Calibri"/>
+                <w:color w:val="1E293B"/>
+                <w:sz w:val="20"/>
+                <w:szCs w:val="20"/>
+              </w:rPr>
+              <w:t xml:space="preserve">magda.luna</w:t>
+            </w:r>
+          </w:p>
+        </w:tc>
+        <w:tc>
+          <w:tcPr>
+            <w:shd w:val="clear" w:color="auto" w:fill="FFFFFF"/>
+          </w:tcPr>
+          <w:p>
+            <w:pPr>
+              <w:spacing w:before="40" w:after="40"/>
+            </w:pPr>
+            <w:r>
+              <w:rPr>
+                <w:rFonts w:ascii="Calibri" w:hAnsi="Calibri"/>
+                <w:color w:val="1E293B"/>
+                <w:sz w:val="20"/>
+                <w:szCs w:val="20"/>
+              </w:rPr>
+              <w:t xml:space="preserve">PM-MAG318</w:t>
+            </w:r>
+          </w:p>
+        </w:tc>
+      </w:tr>
+      <w:tr>
+        <w:tc>
+          <w:tcPr>
+            <w:shd w:val="clear" w:color="auto" w:fill="F8FAFC"/>
+          </w:tcPr>
+          <w:p>
+            <w:pPr>
+              <w:spacing w:before="40" w:after="40"/>
+            </w:pPr>
+            <w:r>
+              <w:rPr>
+                <w:rFonts w:ascii="Calibri" w:hAnsi="Calibri"/>
+                <w:color w:val="1E293B"/>
+                <w:sz w:val="20"/>
+                <w:szCs w:val="20"/>
+              </w:rPr>
+              <w:t xml:space="preserve">18</w:t>
+            </w:r>
+          </w:p>
+        </w:tc>
+        <w:tc>
+          <w:tcPr>
+            <w:shd w:val="clear" w:color="auto" w:fill="F8FAFC"/>
+          </w:tcPr>
+          <w:p>
+            <w:pPr>
+              <w:spacing w:before="40" w:after="40"/>
+            </w:pPr>
+            <w:r>
+              <w:rPr>
+                <w:rFonts w:ascii="Calibri" w:hAnsi="Calibri"/>
+                <w:color w:val="1E293B"/>
+                <w:sz w:val="20"/>
+                <w:szCs w:val="20"/>
+              </w:rPr>
+              <w:t xml:space="preserve">Estela Esther Noemí Miranda Moreno</w:t>
+            </w:r>
+          </w:p>
+        </w:tc>
+        <w:tc>
+          <w:tcPr>
+            <w:shd w:val="clear" w:color="auto" w:fill="F8FAFC"/>
+          </w:tcPr>
+          <w:p>
+            <w:pPr>
+              <w:spacing w:before="40" w:after="40"/>
+            </w:pPr>
+            <w:r>
+              <w:rPr>
+                <w:rFonts w:ascii="Calibri" w:hAnsi="Calibri"/>
+                <w:color w:val="1E293B"/>
+                <w:sz w:val="20"/>
+                <w:szCs w:val="20"/>
+              </w:rPr>
+              <w:t xml:space="preserve">estela.miranda</w:t>
+            </w:r>
+          </w:p>
+        </w:tc>
+        <w:tc>
+          <w:tcPr>
+            <w:shd w:val="clear" w:color="auto" w:fill="F8FAFC"/>
+          </w:tcPr>
+          <w:p>
+            <w:pPr>
+              <w:spacing w:before="40" w:after="40"/>
+            </w:pPr>
+            <w:r>
+              <w:rPr>
+                <w:rFonts w:ascii="Calibri" w:hAnsi="Calibri"/>
+                <w:color w:val="1E293B"/>
+                <w:sz w:val="20"/>
+                <w:szCs w:val="20"/>
+              </w:rPr>
+              <w:t xml:space="preserve">PM-EST942</w:t>
+            </w:r>
+          </w:p>
+        </w:tc>
+      </w:tr>
+      <w:tr>
+        <w:tc>
+          <w:tcPr>
+            <w:shd w:val="clear" w:color="auto" w:fill="FFFFFF"/>
+          </w:tcPr>
+          <w:p>
+            <w:pPr>
+              <w:spacing w:before="40" w:after="40"/>
+            </w:pPr>
+            <w:r>
+              <w:rPr>
+                <w:rFonts w:ascii="Calibri" w:hAnsi="Calibri"/>
+                <w:color w:val="1E293B"/>
+                <w:sz w:val="20"/>
+                <w:szCs w:val="20"/>
+              </w:rPr>
+              <w:t xml:space="preserve">19</w:t>
+            </w:r>
+          </w:p>
+        </w:tc>
+        <w:tc>
+          <w:tcPr>
+            <w:shd w:val="clear" w:color="auto" w:fill="FFFFFF"/>
+          </w:tcPr>
+          <w:p>
+            <w:pPr>
+              <w:spacing w:before="40" w:after="40"/>
+            </w:pPr>
+            <w:r>
+              <w:rPr>
+                <w:rFonts w:ascii="Calibri" w:hAnsi="Calibri"/>
+                <w:color w:val="1E293B"/>
+                <w:sz w:val="20"/>
+                <w:szCs w:val="20"/>
+              </w:rPr>
+              <w:t xml:space="preserve">Mirna Paola Ferrer Delgado</w:t>
+            </w:r>
+          </w:p>
+        </w:tc>
+        <w:tc>
+          <w:tcPr>
+            <w:shd w:val="clear" w:color="auto" w:fill="FFFFFF"/>
+          </w:tcPr>
+          <w:p>
+            <w:pPr>
+              <w:spacing w:before="40" w:after="40"/>
+            </w:pPr>
+            <w:r>
+              <w:rPr>
+                <w:rFonts w:ascii="Calibri" w:hAnsi="Calibri"/>
+                <w:color w:val="1E293B"/>
+                <w:sz w:val="20"/>
+                <w:szCs w:val="20"/>
+              </w:rPr>
+              <w:t xml:space="preserve">mirna.ferrer</w:t>
+            </w:r>
+          </w:p>
+        </w:tc>
+        <w:tc>
+          <w:tcPr>
+            <w:shd w:val="clear" w:color="auto" w:fill="FFFFFF"/>
+          </w:tcPr>
+          <w:p>
+            <w:pPr>
+              <w:spacing w:before="40" w:after="40"/>
+            </w:pPr>
+            <w:r>
+              <w:rPr>
+                <w:rFonts w:ascii="Calibri" w:hAnsi="Calibri"/>
+                <w:color w:val="1E293B"/>
+                <w:sz w:val="20"/>
+                <w:szCs w:val="20"/>
+              </w:rPr>
+              <w:t xml:space="preserve">PM-MIR561</w:t>
+            </w:r>
+          </w:p>
+        </w:tc>
+      </w:tr>
+      <w:tr>
+        <w:tc>
+          <w:tcPr>
+            <w:shd w:val="clear" w:color="auto" w:fill="F8FAFC"/>
+          </w:tcPr>
+          <w:p>
+            <w:pPr>
+              <w:spacing w:before="40" w:after="40"/>
+            </w:pPr>
+            <w:r>
+              <w:rPr>
+                <w:rFonts w:ascii="Calibri" w:hAnsi="Calibri"/>
+                <w:color w:val="1E293B"/>
+                <w:sz w:val="20"/>
+                <w:szCs w:val="20"/>
+              </w:rPr>
+              <w:t xml:space="preserve">20</w:t>
+            </w:r>
+          </w:p>
+        </w:tc>
+        <w:tc>
+          <w:tcPr>
+            <w:shd w:val="clear" w:color="auto" w:fill="F8FAFC"/>
+          </w:tcPr>
+          <w:p>
+            <w:pPr>
+              <w:spacing w:before="40" w:after="40"/>
+            </w:pPr>
+            <w:r>
+              <w:rPr>
+                <w:rFonts w:ascii="Calibri" w:hAnsi="Calibri"/>
+                <w:color w:val="1E293B"/>
+                <w:sz w:val="20"/>
+                <w:szCs w:val="20"/>
+              </w:rPr>
+              <w:t xml:space="preserve">Carmen Luisa Polo Linares</w:t>
+            </w:r>
+          </w:p>
+        </w:tc>
+        <w:tc>
+          <w:tcPr>
+            <w:shd w:val="clear" w:color="auto" w:fill="F8FAFC"/>
+          </w:tcPr>
+          <w:p>
+            <w:pPr>
+              <w:spacing w:before="40" w:after="40"/>
+            </w:pPr>
+            <w:r>
+              <w:rPr>
+                <w:rFonts w:ascii="Calibri" w:hAnsi="Calibri"/>
+                <w:color w:val="1E293B"/>
+                <w:sz w:val="20"/>
+                <w:szCs w:val="20"/>
+              </w:rPr>
+              <w:t xml:space="preserve">carmen.polo</w:t>
+            </w:r>
+          </w:p>
+        </w:tc>
+        <w:tc>
+          <w:tcPr>
+            <w:shd w:val="clear" w:color="auto" w:fill="F8FAFC"/>
+          </w:tcPr>
+          <w:p>
+            <w:pPr>
+              <w:spacing w:before="40" w:after="40"/>
+            </w:pPr>
+            <w:r>
+              <w:rPr>
+                <w:rFonts w:ascii="Calibri" w:hAnsi="Calibri"/>
+                <w:color w:val="1E293B"/>
+                <w:sz w:val="20"/>
+                <w:szCs w:val="20"/>
+              </w:rPr>
+              <w:t xml:space="preserve">PM-CLP834</w:t>
+            </w:r>
+          </w:p>
+        </w:tc>
+      </w:tr>
+      <w:tr>
+        <w:tc>
+          <w:tcPr>
+            <w:shd w:val="clear" w:color="auto" w:fill="FFFFFF"/>
+          </w:tcPr>
+          <w:p>
+            <w:pPr>
+              <w:spacing w:before="40" w:after="40"/>
+            </w:pPr>
+            <w:r>
+              <w:rPr>
+                <w:rFonts w:ascii="Calibri" w:hAnsi="Calibri"/>
+                <w:color w:val="1E293B"/>
+                <w:sz w:val="20"/>
+                <w:szCs w:val="20"/>
+              </w:rPr>
+              <w:t xml:space="preserve">21</w:t>
+            </w:r>
+          </w:p>
+        </w:tc>
+        <w:tc>
+          <w:tcPr>
+            <w:shd w:val="clear" w:color="auto" w:fill="FFFFFF"/>
+          </w:tcPr>
+          <w:p>
+            <w:pPr>
+              <w:spacing w:before="40" w:after="40"/>
+            </w:pPr>
+            <w:r>
+              <w:rPr>
+                <w:rFonts w:ascii="Calibri" w:hAnsi="Calibri"/>
+                <w:color w:val="1E293B"/>
+                <w:sz w:val="20"/>
+                <w:szCs w:val="20"/>
+              </w:rPr>
+              <w:t xml:space="preserve">María Aída Carolina Miranda Moreno</w:t>
+            </w:r>
+          </w:p>
+        </w:tc>
+        <w:tc>
+          <w:tcPr>
+            <w:shd w:val="clear" w:color="auto" w:fill="FFFFFF"/>
+          </w:tcPr>
+          <w:p>
+            <w:pPr>
+              <w:spacing w:before="40" w:after="40"/>
+            </w:pPr>
+            <w:r>
+              <w:rPr>
+                <w:rFonts w:ascii="Calibri" w:hAnsi="Calibri"/>
+                <w:color w:val="1E293B"/>
+                <w:sz w:val="20"/>
+                <w:szCs w:val="20"/>
+              </w:rPr>
+              <w:t xml:space="preserve">maria.miranda</w:t>
+            </w:r>
+          </w:p>
+        </w:tc>
+        <w:tc>
+          <w:tcPr>
+            <w:shd w:val="clear" w:color="auto" w:fill="FFFFFF"/>
+          </w:tcPr>
+          <w:p>
+            <w:pPr>
+              <w:spacing w:before="40" w:after="40"/>
+            </w:pPr>
+            <w:r>
+              <w:rPr>
+                <w:rFonts w:ascii="Calibri" w:hAnsi="Calibri"/>
+                <w:color w:val="1E293B"/>
+                <w:sz w:val="20"/>
+                <w:szCs w:val="20"/>
+              </w:rPr>
+              <w:t xml:space="preserve">PM-MCM279</w:t>
+            </w:r>
+          </w:p>
+        </w:tc>
+      </w:tr>
+      <w:tr>
+        <w:tc>
+          <w:tcPr>
+            <w:shd w:val="clear" w:color="auto" w:fill="F8FAFC"/>
+          </w:tcPr>
+          <w:p>
+            <w:pPr>
+              <w:spacing w:before="40" w:after="40"/>
+            </w:pPr>
+            <w:r>
+              <w:rPr>
+                <w:rFonts w:ascii="Calibri" w:hAnsi="Calibri"/>
+                <w:color w:val="1E293B"/>
+                <w:sz w:val="20"/>
+                <w:szCs w:val="20"/>
+              </w:rPr>
+              <w:t xml:space="preserve">22</w:t>
+            </w:r>
+          </w:p>
+        </w:tc>
+        <w:tc>
+          <w:tcPr>
+            <w:shd w:val="clear" w:color="auto" w:fill="F8FAFC"/>
+          </w:tcPr>
+          <w:p>
+            <w:pPr>
+              <w:spacing w:before="40" w:after="40"/>
+            </w:pPr>
+            <w:r>
+              <w:rPr>
+                <w:rFonts w:ascii="Calibri" w:hAnsi="Calibri"/>
+                <w:color w:val="1E293B"/>
+                <w:sz w:val="20"/>
+                <w:szCs w:val="20"/>
+              </w:rPr>
+              <w:t xml:space="preserve">Christian Edinson Uceda Castañeda</w:t>
+            </w:r>
+          </w:p>
+        </w:tc>
+        <w:tc>
+          <w:tcPr>
+            <w:shd w:val="clear" w:color="auto" w:fill="F8FAFC"/>
+          </w:tcPr>
+          <w:p>
+            <w:pPr>
+              <w:spacing w:before="40" w:after="40"/>
+            </w:pPr>
+            <w:r>
+              <w:rPr>
+                <w:rFonts w:ascii="Calibri" w:hAnsi="Calibri"/>
+                <w:color w:val="1E293B"/>
+                <w:sz w:val="20"/>
+                <w:szCs w:val="20"/>
+              </w:rPr>
+              <w:t xml:space="preserve">christian.uceda</w:t>
+            </w:r>
+          </w:p>
+        </w:tc>
+        <w:tc>
+          <w:tcPr>
+            <w:shd w:val="clear" w:color="auto" w:fill="F8FAFC"/>
+          </w:tcPr>
+          <w:p>
+            <w:pPr>
+              <w:spacing w:before="40" w:after="40"/>
+            </w:pPr>
+            <w:r>
+              <w:rPr>
+                <w:rFonts w:ascii="Calibri" w:hAnsi="Calibri"/>
+                <w:color w:val="1E293B"/>
+                <w:sz w:val="20"/>
+                <w:szCs w:val="20"/>
+              </w:rPr>
+              <w:t xml:space="preserve">PM-CHR615</w:t>
+            </w:r>
+          </w:p>
+        </w:tc>
+      </w:tr>
+      <w:tr>
+        <w:tc>
+          <w:tcPr>
+            <w:shd w:val="clear" w:color="auto" w:fill="FFFFFF"/>
+          </w:tcPr>
+          <w:p>
+            <w:pPr>
+              <w:spacing w:before="40" w:after="40"/>
+            </w:pPr>
+            <w:r>
+              <w:rPr>
+                <w:rFonts w:ascii="Calibri" w:hAnsi="Calibri"/>
+                <w:color w:val="1E293B"/>
+                <w:sz w:val="20"/>
+                <w:szCs w:val="20"/>
+              </w:rPr>
+              <w:t xml:space="preserve">23</w:t>
+            </w:r>
+          </w:p>
+        </w:tc>
+        <w:tc>
+          <w:tcPr>
+            <w:shd w:val="clear" w:color="auto" w:fill="FFFFFF"/>
+          </w:tcPr>
+          <w:p>
+            <w:pPr>
+              <w:spacing w:before="40" w:after="40"/>
+            </w:pPr>
+            <w:r>
+              <w:rPr>
+                <w:rFonts w:ascii="Calibri" w:hAnsi="Calibri"/>
+                <w:color w:val="1E293B"/>
+                <w:sz w:val="20"/>
+                <w:szCs w:val="20"/>
+              </w:rPr>
+              <w:t xml:space="preserve">Sandra Ines Contti Chavez</w:t>
+            </w:r>
+          </w:p>
+        </w:tc>
+        <w:tc>
+          <w:tcPr>
+            <w:shd w:val="clear" w:color="auto" w:fill="FFFFFF"/>
+          </w:tcPr>
+          <w:p>
+            <w:pPr>
+              <w:spacing w:before="40" w:after="40"/>
+            </w:pPr>
+            <w:r>
+              <w:rPr>
+                <w:rFonts w:ascii="Calibri" w:hAnsi="Calibri"/>
+                <w:color w:val="1E293B"/>
+                <w:sz w:val="20"/>
+                <w:szCs w:val="20"/>
+              </w:rPr>
+              <w:t xml:space="preserve">sandra.contti</w:t>
+            </w:r>
+          </w:p>
+        </w:tc>
+        <w:tc>
+          <w:tcPr>
+            <w:shd w:val="clear" w:color="auto" w:fill="FFFFFF"/>
+          </w:tcPr>
+          <w:p>
+            <w:pPr>
+              <w:spacing w:before="40" w:after="40"/>
+            </w:pPr>
+            <w:r>
+              <w:rPr>
+                <w:rFonts w:ascii="Calibri" w:hAnsi="Calibri"/>
+                <w:color w:val="1E293B"/>
+                <w:sz w:val="20"/>
+                <w:szCs w:val="20"/>
+              </w:rPr>
+              <w:t xml:space="preserve">PM-SAN487</w:t>
+            </w:r>
+          </w:p>
+        </w:tc>
+      </w:tr>
+      <w:tr>
+        <w:tc>
+          <w:tcPr>
+            <w:shd w:val="clear" w:color="auto" w:fill="F8FAFC"/>
+          </w:tcPr>
+          <w:p>
+            <w:pPr>
+              <w:spacing w:before="40" w:after="40"/>
+            </w:pPr>
+            <w:r>
+              <w:rPr>
+                <w:rFonts w:ascii="Calibri" w:hAnsi="Calibri"/>
+                <w:color w:val="1E293B"/>
+                <w:sz w:val="20"/>
+                <w:szCs w:val="20"/>
+              </w:rPr>
+              <w:t xml:space="preserve">24</w:t>
+            </w:r>
+          </w:p>
+        </w:tc>
+        <w:tc>
+          <w:tcPr>
+            <w:shd w:val="clear" w:color="auto" w:fill="F8FAFC"/>
+          </w:tcPr>
+          <w:p>
+            <w:pPr>
+              <w:spacing w:before="40" w:after="40"/>
+            </w:pPr>
+            <w:r>
+              <w:rPr>
+                <w:rFonts w:ascii="Calibri" w:hAnsi="Calibri"/>
+                <w:color w:val="1E293B"/>
+                <w:sz w:val="20"/>
+                <w:szCs w:val="20"/>
+              </w:rPr>
+              <w:t xml:space="preserve">Laly Arce Chumpitassi</w:t>
+            </w:r>
+          </w:p>
+        </w:tc>
+        <w:tc>
+          <w:tcPr>
+            <w:shd w:val="clear" w:color="auto" w:fill="F8FAFC"/>
+          </w:tcPr>
+          <w:p>
+            <w:pPr>
+              <w:spacing w:before="40" w:after="40"/>
+            </w:pPr>
+            <w:r>
+              <w:rPr>
+                <w:rFonts w:ascii="Calibri" w:hAnsi="Calibri"/>
+                <w:color w:val="1E293B"/>
+                <w:sz w:val="20"/>
+                <w:szCs w:val="20"/>
+              </w:rPr>
+              <w:t xml:space="preserve">laly.arce</w:t>
+            </w:r>
+          </w:p>
+        </w:tc>
+        <w:tc>
+          <w:tcPr>
+            <w:shd w:val="clear" w:color="auto" w:fill="F8FAFC"/>
+          </w:tcPr>
+          <w:p>
+            <w:pPr>
+              <w:spacing w:before="40" w:after="40"/>
+            </w:pPr>
+            <w:r>
+              <w:rPr>
+                <w:rFonts w:ascii="Calibri" w:hAnsi="Calibri"/>
+                <w:color w:val="1E293B"/>
+                <w:sz w:val="20"/>
+                <w:szCs w:val="20"/>
+              </w:rPr>
+              <w:t xml:space="preserve">PM-LAL726</w:t>
+            </w:r>
+          </w:p>
+        </w:tc>
+      </w:tr>
+      <w:tr>
+        <w:tc>
+          <w:tcPr>
+            <w:shd w:val="clear" w:color="auto" w:fill="FFFFFF"/>
+          </w:tcPr>
+          <w:p>
+            <w:pPr>
+              <w:spacing w:before="40" w:after="40"/>
+            </w:pPr>
+            <w:r>
+              <w:rPr>
+                <w:rFonts w:ascii="Calibri" w:hAnsi="Calibri"/>
+                <w:color w:val="1E293B"/>
+                <w:sz w:val="20"/>
+                <w:szCs w:val="20"/>
+              </w:rPr>
+              <w:t xml:space="preserve">25</w:t>
+            </w:r>
+          </w:p>
+        </w:tc>
+        <w:tc>
+          <w:tcPr>
+            <w:shd w:val="clear" w:color="auto" w:fill="FFFFFF"/>
+          </w:tcPr>
+          <w:p>
+            <w:pPr>
+              <w:spacing w:before="40" w:after="40"/>
+            </w:pPr>
+            <w:r>
+              <w:rPr>
+                <w:rFonts w:ascii="Calibri" w:hAnsi="Calibri"/>
+                <w:color w:val="1E293B"/>
+                <w:sz w:val="20"/>
+                <w:szCs w:val="20"/>
+              </w:rPr>
+              <w:t xml:space="preserve">Vanessa Guerrero Castañeda</w:t>
+            </w:r>
+          </w:p>
+        </w:tc>
+        <w:tc>
+          <w:tcPr>
+            <w:shd w:val="clear" w:color="auto" w:fill="FFFFFF"/>
+          </w:tcPr>
+          <w:p>
+            <w:pPr>
+              <w:spacing w:before="40" w:after="40"/>
+            </w:pPr>
+            <w:r>
+              <w:rPr>
+                <w:rFonts w:ascii="Calibri" w:hAnsi="Calibri"/>
+                <w:color w:val="1E293B"/>
+                <w:sz w:val="20"/>
+                <w:szCs w:val="20"/>
+              </w:rPr>
+              <w:t xml:space="preserve">vanessa.guerrero</w:t>
+            </w:r>
+          </w:p>
+        </w:tc>
+        <w:tc>
+          <w:tcPr>
+            <w:shd w:val="clear" w:color="auto" w:fill="FFFFFF"/>
+          </w:tcPr>
+          <w:p>
+            <w:pPr>
+              <w:spacing w:before="40" w:after="40"/>
+            </w:pPr>
+            <w:r>
+              <w:rPr>
+                <w:rFonts w:ascii="Calibri" w:hAnsi="Calibri"/>
+                <w:color w:val="1E293B"/>
+                <w:sz w:val="20"/>
+                <w:szCs w:val="20"/>
+              </w:rPr>
+              <w:t xml:space="preserve">PM-VGC391</w:t>
+            </w:r>
+          </w:p>
+        </w:tc>
+      </w:tr>
+      <w:tr>
+        <w:tc>
+          <w:tcPr>
+            <w:shd w:val="clear" w:color="auto" w:fill="F8FAFC"/>
+          </w:tcPr>
+          <w:p>
+            <w:pPr>
+              <w:spacing w:before="40" w:after="40"/>
+            </w:pPr>
+            <w:r>
+              <w:rPr>
+                <w:rFonts w:ascii="Calibri" w:hAnsi="Calibri"/>
+                <w:color w:val="1E293B"/>
+                <w:sz w:val="20"/>
+                <w:szCs w:val="20"/>
+              </w:rPr>
+              <w:t xml:space="preserve">26</w:t>
+            </w:r>
+          </w:p>
+        </w:tc>
+        <w:tc>
+          <w:tcPr>
+            <w:shd w:val="clear" w:color="auto" w:fill="F8FAFC"/>
+          </w:tcPr>
+          <w:p>
+            <w:pPr>
+              <w:spacing w:before="40" w:after="40"/>
+            </w:pPr>
+            <w:r>
+              <w:rPr>
+                <w:rFonts w:ascii="Calibri" w:hAnsi="Calibri"/>
+                <w:color w:val="1E293B"/>
+                <w:sz w:val="20"/>
+                <w:szCs w:val="20"/>
+              </w:rPr>
+              <w:t xml:space="preserve">Percy Giancarlo Rios Parravicini</w:t>
+            </w:r>
+          </w:p>
+        </w:tc>
+        <w:tc>
+          <w:tcPr>
+            <w:shd w:val="clear" w:color="auto" w:fill="F8FAFC"/>
+          </w:tcPr>
+          <w:p>
+            <w:pPr>
+              <w:spacing w:before="40" w:after="40"/>
+            </w:pPr>
+            <w:r>
+              <w:rPr>
+                <w:rFonts w:ascii="Calibri" w:hAnsi="Calibri"/>
+                <w:color w:val="1E293B"/>
+                <w:sz w:val="20"/>
+                <w:szCs w:val="20"/>
+              </w:rPr>
+              <w:t xml:space="preserve">percy.rios</w:t>
+            </w:r>
+          </w:p>
+        </w:tc>
+        <w:tc>
+          <w:tcPr>
+            <w:shd w:val="clear" w:color="auto" w:fill="F8FAFC"/>
+          </w:tcPr>
+          <w:p>
+            <w:pPr>
+              <w:spacing w:before="40" w:after="40"/>
+            </w:pPr>
+            <w:r>
+              <w:rPr>
+                <w:rFonts w:ascii="Calibri" w:hAnsi="Calibri"/>
+                <w:color w:val="1E293B"/>
+                <w:sz w:val="20"/>
+                <w:szCs w:val="20"/>
+              </w:rPr>
+              <w:t xml:space="preserve">PM-PER852</w:t>
+            </w:r>
+          </w:p>
+        </w:tc>
+      </w:tr>
+      <w:tr>
+        <w:tc>
+          <w:tcPr>
+            <w:shd w:val="clear" w:color="auto" w:fill="FFFFFF"/>
+          </w:tcPr>
+          <w:p>
+            <w:pPr>
+              <w:spacing w:before="40" w:after="40"/>
+            </w:pPr>
+            <w:r>
+              <w:rPr>
+                <w:rFonts w:ascii="Calibri" w:hAnsi="Calibri"/>
+                <w:color w:val="1E293B"/>
+                <w:sz w:val="20"/>
+                <w:szCs w:val="20"/>
+              </w:rPr>
+              <w:t xml:space="preserve">27</w:t>
+            </w:r>
+          </w:p>
+        </w:tc>
+        <w:tc>
+          <w:tcPr>
+            <w:shd w:val="clear" w:color="auto" w:fill="FFFFFF"/>
+          </w:tcPr>
+          <w:p>
+            <w:pPr>
+              <w:spacing w:before="40" w:after="40"/>
+            </w:pPr>
+            <w:r>
+              <w:rPr>
+                <w:rFonts w:ascii="Calibri" w:hAnsi="Calibri"/>
+                <w:color w:val="1E293B"/>
+                <w:sz w:val="20"/>
+                <w:szCs w:val="20"/>
+              </w:rPr>
+              <w:t xml:space="preserve">Vanessa Rebeca Marín Fernández</w:t>
+            </w:r>
+          </w:p>
+        </w:tc>
+        <w:tc>
+          <w:tcPr>
+            <w:shd w:val="clear" w:color="auto" w:fill="FFFFFF"/>
+          </w:tcPr>
+          <w:p>
+            <w:pPr>
+              <w:spacing w:before="40" w:after="40"/>
+            </w:pPr>
+            <w:r>
+              <w:rPr>
+                <w:rFonts w:ascii="Calibri" w:hAnsi="Calibri"/>
+                <w:color w:val="1E293B"/>
+                <w:sz w:val="20"/>
+                <w:szCs w:val="20"/>
+              </w:rPr>
+              <w:t xml:space="preserve">vanessa.marin</w:t>
+            </w:r>
+          </w:p>
+        </w:tc>
+        <w:tc>
+          <w:tcPr>
+            <w:shd w:val="clear" w:color="auto" w:fill="FFFFFF"/>
+          </w:tcPr>
+          <w:p>
+            <w:pPr>
+              <w:spacing w:before="40" w:after="40"/>
+            </w:pPr>
+            <w:r>
+              <w:rPr>
+                <w:rFonts w:ascii="Calibri" w:hAnsi="Calibri"/>
+                <w:color w:val="1E293B"/>
+                <w:sz w:val="20"/>
+                <w:szCs w:val="20"/>
+              </w:rPr>
+              <w:t xml:space="preserve">PM-VRM614</w:t>
+            </w:r>
+          </w:p>
+        </w:tc>
+      </w:tr>
+      <w:tr>
+        <w:tc>
+          <w:tcPr>
+            <w:shd w:val="clear" w:color="auto" w:fill="F8FAFC"/>
+          </w:tcPr>
+          <w:p>
+            <w:pPr>
+              <w:spacing w:before="40" w:after="40"/>
+            </w:pPr>
+            <w:r>
+              <w:rPr>
+                <w:rFonts w:ascii="Calibri" w:hAnsi="Calibri"/>
+                <w:color w:val="1E293B"/>
+                <w:sz w:val="20"/>
+                <w:szCs w:val="20"/>
+              </w:rPr>
+              <w:t xml:space="preserve">28</w:t>
+            </w:r>
+          </w:p>
+        </w:tc>
+        <w:tc>
+          <w:tcPr>
+            <w:shd w:val="clear" w:color="auto" w:fill="F8FAFC"/>
+          </w:tcPr>
+          <w:p>
+            <w:pPr>
+              <w:spacing w:before="40" w:after="40"/>
+            </w:pPr>
+            <w:r>
+              <w:rPr>
+                <w:rFonts w:ascii="Calibri" w:hAnsi="Calibri"/>
+                <w:color w:val="1E293B"/>
+                <w:sz w:val="20"/>
+                <w:szCs w:val="20"/>
+              </w:rPr>
+              <w:t xml:space="preserve">Cynthia Jav</w:t>
+            </w:r>
+          </w:p>
+        </w:tc>
+        <w:tc>
+          <w:tcPr>
+            <w:shd w:val="clear" w:color="auto" w:fill="F8FAFC"/>
+          </w:tcPr>
+          <w:p>
+            <w:pPr>
+              <w:spacing w:before="40" w:after="40"/>
+            </w:pPr>
+            <w:r>
+              <w:rPr>
+                <w:rFonts w:ascii="Calibri" w:hAnsi="Calibri"/>
+                <w:color w:val="1E293B"/>
+                <w:sz w:val="20"/>
+                <w:szCs w:val="20"/>
+              </w:rPr>
+              <w:t xml:space="preserve">cynthia.jav</w:t>
+            </w:r>
+          </w:p>
+        </w:tc>
+        <w:tc>
+          <w:tcPr>
+            <w:shd w:val="clear" w:color="auto" w:fill="F8FAFC"/>
+          </w:tcPr>
+          <w:p>
+            <w:pPr>
+              <w:spacing w:before="40" w:after="40"/>
+            </w:pPr>
+            <w:r>
+              <w:rPr>
+                <w:rFonts w:ascii="Calibri" w:hAnsi="Calibri"/>
+                <w:color w:val="1E293B"/>
+                <w:sz w:val="20"/>
+                <w:szCs w:val="20"/>
+              </w:rPr>
+              <w:t xml:space="preserve">PM-CYN529</w:t>
+            </w:r>
+          </w:p>
+        </w:tc>
+      </w:tr>
+      <w:tr>
+        <w:tc>
+          <w:tcPr>
+            <w:shd w:val="clear" w:color="auto" w:fill="FFFFFF"/>
+          </w:tcPr>
+          <w:p>
+            <w:pPr>
+              <w:spacing w:before="40" w:after="40"/>
+            </w:pPr>
+            <w:r>
+              <w:rPr>
+                <w:rFonts w:ascii="Calibri" w:hAnsi="Calibri"/>
+                <w:color w:val="1E293B"/>
+                <w:sz w:val="20"/>
+                <w:szCs w:val="20"/>
+              </w:rPr>
+              <w:t xml:space="preserve">29</w:t>
+            </w:r>
+          </w:p>
+        </w:tc>
+        <w:tc>
+          <w:tcPr>
+            <w:shd w:val="clear" w:color="auto" w:fill="FFFFFF"/>
+          </w:tcPr>
+          <w:p>
+            <w:pPr>
+              <w:spacing w:before="40" w:after="40"/>
+            </w:pPr>
+            <w:r>
+              <w:rPr>
+                <w:rFonts w:ascii="Calibri" w:hAnsi="Calibri"/>
+                <w:color w:val="1E293B"/>
+                <w:sz w:val="20"/>
+                <w:szCs w:val="20"/>
+              </w:rPr>
+              <w:t xml:space="preserve">Carmen Herrera Baldeon</w:t>
+            </w:r>
+          </w:p>
+        </w:tc>
+        <w:tc>
+          <w:tcPr>
+            <w:shd w:val="clear" w:color="auto" w:fill="FFFFFF"/>
+          </w:tcPr>
+          <w:p>
+            <w:pPr>
+              <w:spacing w:before="40" w:after="40"/>
+            </w:pPr>
+            <w:r>
+              <w:rPr>
+                <w:rFonts w:ascii="Calibri" w:hAnsi="Calibri"/>
+                <w:color w:val="1E293B"/>
+                <w:sz w:val="20"/>
+                <w:szCs w:val="20"/>
+              </w:rPr>
+              <w:t xml:space="preserve">carmen.herrera</w:t>
+            </w:r>
+          </w:p>
+        </w:tc>
+        <w:tc>
+          <w:tcPr>
+            <w:shd w:val="clear" w:color="auto" w:fill="FFFFFF"/>
+          </w:tcPr>
+          <w:p>
+            <w:pPr>
+              <w:spacing w:before="40" w:after="40"/>
+            </w:pPr>
+            <w:r>
+              <w:rPr>
+                <w:rFonts w:ascii="Calibri" w:hAnsi="Calibri"/>
+                <w:color w:val="1E293B"/>
+                <w:sz w:val="20"/>
+                <w:szCs w:val="20"/>
+              </w:rPr>
+              <w:t xml:space="preserve">PM-CHB738</w:t>
+            </w:r>
+          </w:p>
+        </w:tc>
+      </w:tr>
+      <w:tr>
+        <w:tc>
+          <w:tcPr>
+            <w:shd w:val="clear" w:color="auto" w:fill="F8FAFC"/>
+          </w:tcPr>
+          <w:p>
+            <w:pPr>
+              <w:spacing w:before="40" w:after="40"/>
+            </w:pPr>
+            <w:r>
+              <w:rPr>
+                <w:rFonts w:ascii="Calibri" w:hAnsi="Calibri"/>
+                <w:color w:val="1E293B"/>
+                <w:sz w:val="20"/>
+                <w:szCs w:val="20"/>
+              </w:rPr>
+              <w:t xml:space="preserve">30</w:t>
+            </w:r>
+          </w:p>
+        </w:tc>
+        <w:tc>
+          <w:tcPr>
+            <w:shd w:val="clear" w:color="auto" w:fill="F8FAFC"/>
+          </w:tcPr>
+          <w:p>
+            <w:pPr>
+              <w:spacing w:before="40" w:after="40"/>
+            </w:pPr>
+            <w:r>
+              <w:rPr>
+                <w:rFonts w:ascii="Calibri" w:hAnsi="Calibri"/>
+                <w:color w:val="1E293B"/>
+                <w:sz w:val="20"/>
+                <w:szCs w:val="20"/>
+              </w:rPr>
+              <w:t xml:space="preserve">Aracely Milagros Roman Loja</w:t>
+            </w:r>
+          </w:p>
+        </w:tc>
+        <w:tc>
+          <w:tcPr>
+            <w:shd w:val="clear" w:color="auto" w:fill="F8FAFC"/>
+          </w:tcPr>
+          <w:p>
+            <w:pPr>
+              <w:spacing w:before="40" w:after="40"/>
+            </w:pPr>
+            <w:r>
+              <w:rPr>
+                <w:rFonts w:ascii="Calibri" w:hAnsi="Calibri"/>
+                <w:color w:val="1E293B"/>
+                <w:sz w:val="20"/>
+                <w:szCs w:val="20"/>
+              </w:rPr>
+              <w:t xml:space="preserve">aracely.roman</w:t>
+            </w:r>
+          </w:p>
+        </w:tc>
+        <w:tc>
+          <w:tcPr>
+            <w:shd w:val="clear" w:color="auto" w:fill="F8FAFC"/>
+          </w:tcPr>
+          <w:p>
+            <w:pPr>
+              <w:spacing w:before="40" w:after="40"/>
+            </w:pPr>
+            <w:r>
+              <w:rPr>
+                <w:rFonts w:ascii="Calibri" w:hAnsi="Calibri"/>
+                <w:color w:val="1E293B"/>
+                <w:sz w:val="20"/>
+                <w:szCs w:val="20"/>
+              </w:rPr>
+              <w:t xml:space="preserve">PM-ARA943</w:t>
             </w:r>
           </w:p>
         </w:tc>

</xml_diff>

<commit_message>
feat: agregar estudiante Olga Teresa Poicon Ormeno y actualizar Word
</commit_message>
<xml_diff>
--- a/Credenciales_Polyglot_Map_Bootcamp.docx
+++ b/Credenciales_Polyglot_Map_Bootcamp.docx
@@ -388,7 +388,7 @@
           <w:sz w:val="26"/>
           <w:szCs w:val="26"/>
         </w:rPr>
-        <w:t xml:space="preserve">2. CREDENCIALES DE ESTUDIANTES INSCRITOS (30 ALUMNOS NOMINALES)</w:t>
+        <w:t xml:space="preserve">2. CREDENCIALES DE ESTUDIANTES INSCRITOS (31 ALUMNOS NOMINALES)</w:t>
       </w:r>
     </w:p>
     <w:p>
@@ -402,7 +402,7 @@
           <w:sz w:val="20"/>
           <w:szCs w:val="20"/>
         </w:rPr>
-        <w:t xml:space="preserve">Nota: Los estudiantes pueden ingresar escribiendo su usuario (ej. magda.luna) o su nombre y apellido.</w:t>
+        <w:t xml:space="preserve">Nota: Los estudiantes pueden ingresar escribiendo su usuario (ej. olga.poicon) o su nombre y apellido.</w:t>
       </w:r>
     </w:p>
     <w:tbl>
@@ -2841,6 +2841,84 @@
                 <w:szCs w:val="20"/>
               </w:rPr>
               <w:t xml:space="preserve">PM-ARA943</w:t>
+            </w:r>
+          </w:p>
+        </w:tc>
+      </w:tr>
+      <w:tr>
+        <w:tc>
+          <w:tcPr>
+            <w:shd w:val="clear" w:color="auto" w:fill="FFFFFF"/>
+          </w:tcPr>
+          <w:p>
+            <w:pPr>
+              <w:spacing w:before="40" w:after="40"/>
+            </w:pPr>
+            <w:r>
+              <w:rPr>
+                <w:rFonts w:ascii="Calibri" w:hAnsi="Calibri"/>
+                <w:color w:val="1E293B"/>
+                <w:sz w:val="20"/>
+                <w:szCs w:val="20"/>
+              </w:rPr>
+              <w:t xml:space="preserve">31</w:t>
+            </w:r>
+          </w:p>
+        </w:tc>
+        <w:tc>
+          <w:tcPr>
+            <w:shd w:val="clear" w:color="auto" w:fill="FFFFFF"/>
+          </w:tcPr>
+          <w:p>
+            <w:pPr>
+              <w:spacing w:before="40" w:after="40"/>
+            </w:pPr>
+            <w:r>
+              <w:rPr>
+                <w:rFonts w:ascii="Calibri" w:hAnsi="Calibri"/>
+                <w:color w:val="1E293B"/>
+                <w:sz w:val="20"/>
+                <w:szCs w:val="20"/>
+              </w:rPr>
+              <w:t xml:space="preserve">Olga Teresa Poicón Ormeño</w:t>
+            </w:r>
+          </w:p>
+        </w:tc>
+        <w:tc>
+          <w:tcPr>
+            <w:shd w:val="clear" w:color="auto" w:fill="FFFFFF"/>
+          </w:tcPr>
+          <w:p>
+            <w:pPr>
+              <w:spacing w:before="40" w:after="40"/>
+            </w:pPr>
+            <w:r>
+              <w:rPr>
+                <w:rFonts w:ascii="Calibri" w:hAnsi="Calibri"/>
+                <w:color w:val="1E293B"/>
+                <w:sz w:val="20"/>
+                <w:szCs w:val="20"/>
+              </w:rPr>
+              <w:t xml:space="preserve">olga.poicon</w:t>
+            </w:r>
+          </w:p>
+        </w:tc>
+        <w:tc>
+          <w:tcPr>
+            <w:shd w:val="clear" w:color="auto" w:fill="FFFFFF"/>
+          </w:tcPr>
+          <w:p>
+            <w:pPr>
+              <w:spacing w:before="40" w:after="40"/>
+            </w:pPr>
+            <w:r>
+              <w:rPr>
+                <w:rFonts w:ascii="Calibri" w:hAnsi="Calibri"/>
+                <w:color w:val="1E293B"/>
+                <w:sz w:val="20"/>
+                <w:szCs w:val="20"/>
+              </w:rPr>
+              <w:t xml:space="preserve">PM-OLG739</w:t>
             </w:r>
           </w:p>
         </w:tc>

</xml_diff>